<commit_message>
Day13 Add tests for handling authenticated popups, browser context, and window/tab management in Playwright
</commit_message>
<xml_diff>
--- a/MyNotes/Playwright with Typescript SDET Pavan.docx
+++ b/MyNotes/Playwright with Typescript SDET Pavan.docx
@@ -9017,13 +9017,7 @@
         </w:numPr>
       </w:pPr>
       <w:r>
-        <w:t>A dialog (alert window) is</w:t>
-      </w:r>
-      <w:r>
-        <w:t xml:space="preserve"> </w:t>
-      </w:r>
-      <w:r>
-        <w:t>Not part of the DOM</w:t>
+        <w:t>A dialog (alert window) is Not part of the DOM</w:t>
       </w:r>
     </w:p>
     <w:p>
@@ -9035,25 +9029,7 @@
         </w:numPr>
       </w:pPr>
       <w:r>
-        <w:t>Triggered using</w:t>
-      </w:r>
-      <w:r>
-        <w:t xml:space="preserve"> </w:t>
-      </w:r>
-      <w:r>
-        <w:t>alert()</w:t>
-      </w:r>
-      <w:r>
-        <w:t xml:space="preserve">, </w:t>
-      </w:r>
-      <w:r>
-        <w:t>confirm()</w:t>
-      </w:r>
-      <w:r>
-        <w:t xml:space="preserve">, </w:t>
-      </w:r>
-      <w:r>
-        <w:t>prompt()</w:t>
+        <w:t>Triggered using alert(), confirm(), prompt()</w:t>
       </w:r>
     </w:p>
     <w:p>
@@ -9093,14 +9069,7 @@
           <w:b/>
           <w:bCs/>
         </w:rPr>
-        <w:t>How Playwright Handles Dialogs</w:t>
-      </w:r>
-      <w:r>
-        <w:rPr>
-          <w:b/>
-          <w:bCs/>
-        </w:rPr>
-        <w:t>?</w:t>
+        <w:t>How Playwright Handles Dialogs?</w:t>
       </w:r>
     </w:p>
     <w:p>
@@ -9112,19 +9081,7 @@
         </w:numPr>
       </w:pPr>
       <w:r>
-        <w:t>By default</w:t>
-      </w:r>
-      <w:r>
-        <w:t xml:space="preserve"> </w:t>
-      </w:r>
-      <w:r>
-        <w:t>Alerts</w:t>
-      </w:r>
-      <w:r>
-        <w:t>, Confirm &amp; Prompt</w:t>
-      </w:r>
-      <w:r>
-        <w:t xml:space="preserve"> are auto-dismissed</w:t>
+        <w:t>By default Alerts, Confirm &amp; Prompt are auto-dismissed</w:t>
       </w:r>
     </w:p>
     <w:p>
@@ -9906,13 +9863,7 @@
         <w:spacing w:after="0" w:line="360" w:lineRule="auto"/>
       </w:pPr>
       <w:r>
-        <w:t xml:space="preserve">Handle the </w:t>
-      </w:r>
-      <w:r>
-        <w:t>confirmation</w:t>
-      </w:r>
-      <w:r>
-        <w:t xml:space="preserve"> prompt</w:t>
+        <w:t>Handle the confirmation prompt</w:t>
       </w:r>
     </w:p>
     <w:p>
@@ -9970,13 +9921,7 @@
         <w:t>✔</w:t>
       </w:r>
       <w:r>
-        <w:t xml:space="preserve"> Case 1:</w:t>
-      </w:r>
-      <w:r>
-        <w:t xml:space="preserve"> </w:t>
-      </w:r>
-      <w:r>
-        <w:t>Click OK using dialog.accept()</w:t>
+        <w:t xml:space="preserve"> Case 1: Click OK using dialog.accept()</w:t>
       </w:r>
     </w:p>
     <w:p>
@@ -9995,13 +9940,7 @@
         <w:t>✔</w:t>
       </w:r>
       <w:r>
-        <w:t xml:space="preserve"> Case 2:</w:t>
-      </w:r>
-      <w:r>
-        <w:t xml:space="preserve"> </w:t>
-      </w:r>
-      <w:r>
-        <w:t>Click Cancel using dialog.dismiss()</w:t>
+        <w:t xml:space="preserve"> Case 2: Click Cancel using dialog.dismiss()</w:t>
       </w:r>
     </w:p>
     <w:p>
@@ -10014,10 +9953,7 @@
         <w:spacing w:after="0" w:line="360" w:lineRule="auto"/>
       </w:pPr>
       <w:r>
-        <w:t xml:space="preserve">Handle the </w:t>
-      </w:r>
-      <w:r>
-        <w:t>Prompt dialog</w:t>
+        <w:t>Handle the Prompt dialog</w:t>
       </w:r>
     </w:p>
     <w:p>
@@ -10075,19 +10011,7 @@
         <w:t>✔</w:t>
       </w:r>
       <w:r>
-        <w:t xml:space="preserve"> Case 1:</w:t>
-      </w:r>
-      <w:r>
-        <w:t xml:space="preserve"> </w:t>
-      </w:r>
-      <w:r>
-        <w:t>Enter text using:</w:t>
-      </w:r>
-      <w:r>
-        <w:t xml:space="preserve"> </w:t>
-      </w:r>
-      <w:r>
-        <w:t>dialog.accept("YourText");</w:t>
+        <w:t xml:space="preserve"> Case 1: Enter text using: dialog.accept("YourText");</w:t>
       </w:r>
     </w:p>
     <w:p>
@@ -10110,16 +10034,7 @@
         <w:t>✔</w:t>
       </w:r>
       <w:r>
-        <w:t xml:space="preserve"> Case 2:</w:t>
-      </w:r>
-      <w:r>
-        <w:t xml:space="preserve"> </w:t>
-      </w:r>
-      <w:r>
-        <w:t xml:space="preserve">Click Cancel </w:t>
-      </w:r>
-      <w:r>
-        <w:t xml:space="preserve">using </w:t>
+        <w:t xml:space="preserve"> Case 2: Click Cancel using </w:t>
       </w:r>
       <w:r>
         <w:t>dialog.dismiss();</w:t>
@@ -10200,28 +10115,13 @@
         </w:rPr>
       </w:pPr>
       <w:r>
-        <w:t>During automation</w:t>
-      </w:r>
-      <w:r>
-        <w:t xml:space="preserve"> </w:t>
-      </w:r>
-      <w:r>
-        <w:t>Default focus is on main page</w:t>
-      </w:r>
-      <w:r>
-        <w:t xml:space="preserve">, </w:t>
+        <w:t xml:space="preserve">During automation Default focus is on main page, </w:t>
       </w:r>
       <w:r>
         <w:t>we</w:t>
       </w:r>
       <w:r>
-        <w:t xml:space="preserve"> must switch </w:t>
-      </w:r>
-      <w:r>
-        <w:t xml:space="preserve">focus </w:t>
-      </w:r>
-      <w:r>
-        <w:t>to iframe</w:t>
+        <w:t xml:space="preserve"> must switch focus to iframe</w:t>
       </w:r>
       <w:r>
         <w:t xml:space="preserve"> interact with it</w:t>
@@ -10395,13 +10295,7 @@
           <w:rPr>
             <w:rStyle w:val="Hyperlink"/>
           </w:rPr>
-          <w:t>https://</w:t>
-        </w:r>
-        <w:r>
-          <w:rPr>
-            <w:rStyle w:val="Hyperlink"/>
-          </w:rPr>
-          <w:t>ui.vision/demo/webtest/frames</w:t>
+          <w:t>https://ui.vision/demo/webtest/frames</w:t>
         </w:r>
       </w:hyperlink>
     </w:p>
@@ -10570,14 +10464,7 @@
           <w:bCs/>
         </w:rPr>
         <w:lastRenderedPageBreak/>
-        <w:t xml:space="preserve">Day13: </w:t>
-      </w:r>
-      <w:r>
-        <w:rPr>
-          <w:b/>
-          <w:bCs/>
-        </w:rPr>
-        <w:t>Browser Context, Tabs &amp; Pages/Popups</w:t>
+        <w:t>Day13: Browser Context, Tabs &amp; Pages/Popups</w:t>
       </w:r>
     </w:p>
     <w:p>
@@ -11005,7 +10892,13 @@
         </w:numPr>
       </w:pPr>
       <w:r>
-        <w:t xml:space="preserve">Context.pages() – This method returns the array of </w:t>
+        <w:t>Context.pages()</w:t>
+      </w:r>
+      <w:r>
+        <w:t>.length()</w:t>
+      </w:r>
+      <w:r>
+        <w:t xml:space="preserve"> – This method returns the array of </w:t>
       </w:r>
       <w:r>
         <w:t>all</w:t>
@@ -11020,19 +10913,24 @@
         <w:t xml:space="preserve"> in context</w:t>
       </w:r>
     </w:p>
-    <w:p/>
-    <w:p>
-      <w:pPr>
-        <w:rPr>
-          <w:b/>
-          <w:bCs/>
-        </w:rPr>
-      </w:pPr>
-      <w:r>
-        <w:rPr>
-          <w:b/>
-          <w:bCs/>
-        </w:rPr>
+    <w:p>
+      <w:r>
+        <w:br w:type="page"/>
+      </w:r>
+    </w:p>
+    <w:p>
+      <w:pPr>
+        <w:rPr>
+          <w:b/>
+          <w:bCs/>
+        </w:rPr>
+      </w:pPr>
+      <w:r>
+        <w:rPr>
+          <w:b/>
+          <w:bCs/>
+        </w:rPr>
+        <w:lastRenderedPageBreak/>
         <w:t xml:space="preserve">How to handle </w:t>
       </w:r>
       <w:r>
@@ -11087,10 +10985,7 @@
         <w:t>Scenario</w:t>
       </w:r>
       <w:r>
-        <w:t xml:space="preserve">: </w:t>
-      </w:r>
-      <w:r>
-        <w:t>When multiple pages open inside the same browser.</w:t>
+        <w:t>: When multiple pages open inside the same browser.</w:t>
       </w:r>
     </w:p>
     <w:p>
@@ -11162,7 +11057,6 @@
           <w:b/>
           <w:bCs/>
         </w:rPr>
-        <w:lastRenderedPageBreak/>
         <w:t>Important</w:t>
       </w:r>
       <w:r>
@@ -11198,10 +11092,13 @@
         <w:t>To achieve this</w:t>
       </w:r>
       <w:r>
-        <w:t>:</w:t>
-      </w:r>
-      <w:r>
-        <w:t xml:space="preserve"> We need to execute both the events parallelly by using method Promise.all()</w:t>
+        <w:t xml:space="preserve">: We need to execute both the events parallelly by using method </w:t>
+      </w:r>
+      <w:r>
+        <w:t xml:space="preserve">called as </w:t>
+      </w:r>
+      <w:r>
+        <w:t>Promise.all()</w:t>
       </w:r>
     </w:p>
     <w:p>
@@ -11252,19 +11149,22 @@
         </w:numPr>
       </w:pPr>
       <w:r>
-        <w:t>Using Promise.all()</w:t>
-      </w:r>
-      <w:r>
-        <w:t xml:space="preserve">: </w:t>
-      </w:r>
-      <w:r>
-        <w:t>To run two asynchronous actions in parallel.</w:t>
-      </w:r>
-      <w:r>
-        <w:t xml:space="preserve"> </w:t>
+        <w:t xml:space="preserve">Using Promise.all(): To run two asynchronous actions in parallel. </w:t>
       </w:r>
       <w:r>
         <w:t>It returns array of resolved values (pages).</w:t>
+      </w:r>
+    </w:p>
+    <w:p>
+      <w:pPr>
+        <w:pStyle w:val="ListParagraph"/>
+        <w:numPr>
+          <w:ilvl w:val="1"/>
+          <w:numId w:val="68"/>
+        </w:numPr>
+      </w:pPr>
+      <w:r>
+        <w:t>Here we don’t want to run the events synchronously or asynchronously that’s why we used promise.all()</w:t>
       </w:r>
     </w:p>
     <w:p/>
@@ -11372,13 +11272,7 @@
         </w:numPr>
       </w:pPr>
       <w:r>
-        <w:t>Approach</w:t>
-      </w:r>
-      <w:r>
-        <w:t>2</w:t>
-      </w:r>
-      <w:r>
-        <w:t xml:space="preserve">: </w:t>
+        <w:t xml:space="preserve">Approach2: </w:t>
       </w:r>
       <w:r>
         <w:t>U</w:t>
@@ -11593,10 +11487,7 @@
         <w:t>//</w:t>
       </w:r>
       <w:r>
-        <w:t xml:space="preserve"> </w:t>
-      </w:r>
-      <w:r>
-        <w:t>page.waitForEvent('popup')</w:t>
+        <w:t xml:space="preserve"> page.waitForEvent('popup')</w:t>
       </w:r>
     </w:p>
     <w:p/>
@@ -11646,13 +11537,7 @@
         </w:numPr>
       </w:pPr>
       <w:r>
-        <w:t xml:space="preserve">Click on the </w:t>
-      </w:r>
-      <w:r>
-        <w:t xml:space="preserve">Popup Windows </w:t>
-      </w:r>
-      <w:r>
-        <w:t>button</w:t>
+        <w:t>Click on the Popup Windows button</w:t>
       </w:r>
     </w:p>
     <w:p>
@@ -11670,16 +11555,7 @@
         <w:t>window</w:t>
       </w:r>
       <w:r>
-        <w:t xml:space="preserve"> </w:t>
-      </w:r>
-      <w:r>
-        <w:t>using ‘</w:t>
-      </w:r>
-      <w:r>
-        <w:t xml:space="preserve">popup’ </w:t>
-      </w:r>
-      <w:r>
-        <w:t>event</w:t>
+        <w:t xml:space="preserve"> using ‘popup’ event</w:t>
       </w:r>
     </w:p>
     <w:p>
@@ -11740,6 +11616,10 @@
           <w:ilvl w:val="0"/>
           <w:numId w:val="72"/>
         </w:numPr>
+        <w:rPr>
+          <w:b/>
+          <w:bCs/>
+        </w:rPr>
       </w:pPr>
       <w:r>
         <w:t xml:space="preserve">Capture the window which has </w:t>
@@ -11758,27 +11638,19 @@
           <w:bCs/>
         </w:rPr>
       </w:pPr>
-      <w:r>
-        <w:rPr>
-          <w:b/>
-          <w:bCs/>
-        </w:rPr>
-        <w:br w:type="page"/>
-      </w:r>
-    </w:p>
-    <w:p>
-      <w:pPr>
-        <w:rPr>
-          <w:b/>
-          <w:bCs/>
-        </w:rPr>
-      </w:pPr>
-      <w:r>
-        <w:rPr>
-          <w:b/>
-          <w:bCs/>
-        </w:rPr>
-        <w:lastRenderedPageBreak/>
+    </w:p>
+    <w:p>
+      <w:pPr>
+        <w:rPr>
+          <w:b/>
+          <w:bCs/>
+        </w:rPr>
+      </w:pPr>
+      <w:r>
+        <w:rPr>
+          <w:b/>
+          <w:bCs/>
+        </w:rPr>
         <w:t>How to handle the authenticat</w:t>
       </w:r>
       <w:r>
@@ -11812,19 +11684,7 @@
           <w:rPr>
             <w:rStyle w:val="Hyperlink"/>
           </w:rPr>
-          <w:t>https://</w:t>
-        </w:r>
-        <w:r>
-          <w:rPr>
-            <w:rStyle w:val="Hyperlink"/>
-          </w:rPr>
-          <w:t>the-internet-herokuapp</w:t>
-        </w:r>
-        <w:r>
-          <w:rPr>
-            <w:rStyle w:val="Hyperlink"/>
-          </w:rPr>
-          <w:t>.com/</w:t>
+          <w:t>https://the-internet-herokuapp.com/</w:t>
         </w:r>
       </w:hyperlink>
     </w:p>

</xml_diff>